<commit_message>
feat: adicionei o tp de solid.
</commit_message>
<xml_diff>
--- a/TP03.docx
+++ b/TP03.docx
@@ -241,17 +241,8 @@
           <w:color w:val="EE0000"/>
           <w:sz w:val="28"/>
         </w:rPr>
-        <w:t xml:space="preserve"> e IoT para integração com dispositivos </w:t>
-      </w:r>
-      <w:proofErr w:type="spellStart"/>
-      <w:r>
-        <w:rPr>
-          <w:color w:val="EE0000"/>
-          <w:sz w:val="28"/>
-        </w:rPr>
-        <w:t>IoT</w:t>
-      </w:r>
-      <w:proofErr w:type="spellEnd"/>
+        <w:t xml:space="preserve"> e IoT para integração com dispositivos IoT</w:t>
+      </w:r>
     </w:p>
     <w:p>
       <w:pPr>
@@ -759,14 +750,7 @@
           <w:color w:val="EE0000"/>
           <w:sz w:val="28"/>
         </w:rPr>
-        <w:t>Vantagens</w:t>
-      </w:r>
-      <w:r>
-        <w:rPr>
-          <w:color w:val="EE0000"/>
-          <w:sz w:val="28"/>
-        </w:rPr>
-        <w:t>:</w:t>
+        <w:t>Vantagens:</w:t>
       </w:r>
     </w:p>
     <w:p>
@@ -823,14 +807,7 @@
           <w:color w:val="EE0000"/>
           <w:sz w:val="28"/>
         </w:rPr>
-        <w:t>Desvantagens</w:t>
-      </w:r>
-      <w:r>
-        <w:rPr>
-          <w:color w:val="EE0000"/>
-          <w:sz w:val="28"/>
-        </w:rPr>
-        <w:t>:</w:t>
+        <w:t>Desvantagens:</w:t>
       </w:r>
     </w:p>
     <w:p>
@@ -1282,6 +1259,83 @@
     </w:p>
     <w:p>
       <w:pPr>
+        <w:pStyle w:val="ListParagraph"/>
+        <w:numPr>
+          <w:ilvl w:val="0"/>
+          <w:numId w:val="4"/>
+        </w:numPr>
+        <w:rPr>
+          <w:sz w:val="32"/>
+        </w:rPr>
+      </w:pPr>
+      <w:r>
+        <w:rPr>
+          <w:sz w:val="28"/>
+        </w:rPr>
+        <w:lastRenderedPageBreak/>
+        <w:t>Que recursos podemos utilizar para melhorar a segurança contra a alteração e/ou acesso a arquivos XML/JSON? Procure exemplos de dados sensíveis que trafegam em XML/JSON</w:t>
+      </w:r>
+    </w:p>
+    <w:p>
+      <w:pPr>
+        <w:pStyle w:val="ListParagraph"/>
+        <w:rPr>
+          <w:sz w:val="28"/>
+        </w:rPr>
+      </w:pPr>
+      <w:r>
+        <w:rPr>
+          <w:sz w:val="28"/>
+        </w:rPr>
+        <w:t xml:space="preserve">R: </w:t>
+      </w:r>
+      <w:r>
+        <w:rPr>
+          <w:sz w:val="28"/>
+        </w:rPr>
+        <w:t xml:space="preserve">Para melhorar a segurança de arquivos XML e JSON, podemos usar criptografia, HTTPS e assinaturas digitais. Esses recursos ajudam a proteger os dados durante o envio </w:t>
+      </w:r>
+      <w:proofErr w:type="gramStart"/>
+      <w:r>
+        <w:rPr>
+          <w:sz w:val="28"/>
+        </w:rPr>
+        <w:t>e também</w:t>
+      </w:r>
+      <w:proofErr w:type="gramEnd"/>
+      <w:r>
+        <w:rPr>
+          <w:sz w:val="28"/>
+        </w:rPr>
+        <w:t xml:space="preserve"> evitam que alguém altere as informações sem autorização. Também é comum usar autenticação, como login, tokens ou chaves de acesso, para controlar quem pode acessar os dados.</w:t>
+      </w:r>
+    </w:p>
+    <w:p>
+      <w:pPr>
+        <w:pStyle w:val="ListParagraph"/>
+        <w:rPr>
+          <w:sz w:val="28"/>
+        </w:rPr>
+      </w:pPr>
+    </w:p>
+    <w:p>
+      <w:pPr>
+        <w:pStyle w:val="ListParagraph"/>
+        <w:rPr>
+          <w:color w:val="EE0000"/>
+          <w:sz w:val="32"/>
+        </w:rPr>
+      </w:pPr>
+      <w:r>
+        <w:rPr>
+          <w:color w:val="EE0000"/>
+          <w:sz w:val="28"/>
+        </w:rPr>
+        <w:t>Alguns exemplos de dados sensíveis que podem trafegar em XML ou JSON são dados pessoais (nome, CPF, endereço), informações de login, dados bancários, informações de pagamento e dados médicos. Esses dados precisam ser protegidos para evitar vazamento de informações ou fraudes.</w:t>
+      </w:r>
+    </w:p>
+    <w:p>
+      <w:pPr>
         <w:ind w:left="360"/>
         <w:rPr>
           <w:sz w:val="32"/>
@@ -1291,7 +1345,6 @@
         <w:rPr>
           <w:sz w:val="32"/>
         </w:rPr>
-        <w:lastRenderedPageBreak/>
         <w:t xml:space="preserve">Para cada item, destaque em </w:t>
       </w:r>
       <w:r>
@@ -1419,7 +1472,7 @@
           <w:color w:val="FF0000"/>
           <w:sz w:val="32"/>
         </w:rPr>
-        <w:t>SEG</w:t>
+        <w:t>SEX</w:t>
       </w:r>
       <w:r>
         <w:rPr>

</xml_diff>